<commit_message>
Organize HMS test plan and RTM documents
</commit_message>
<xml_diff>
--- a/docs/Test_Plan_HMS.docx
+++ b/docs/Test_Plan_HMS.docx
@@ -11587,6 +11587,130 @@
                 <w:rtl w:val="0"/>
               </w:rPr>
               <w:t xml:space="preserve">Low</w:t>
+            </w:r>
+          </w:p>
+        </w:tc>
+      </w:tr>
+      <w:tr>
+        <w:tc>
+          <w:tcPr>
+            <w:tcW w:type="dxa" w:w="1658"/>
+          </w:tcPr>
+          <w:p>
+            <w:r>
+              <w:t>TC-ROOM-005</w:t>
+            </w:r>
+          </w:p>
+        </w:tc>
+        <w:tc>
+          <w:tcPr>
+            <w:tcW w:type="dxa" w:w="1678"/>
+          </w:tcPr>
+          <w:p>
+            <w:r>
+              <w:t>Reject missing required room field</w:t>
+            </w:r>
+          </w:p>
+        </w:tc>
+        <w:tc>
+          <w:tcPr>
+            <w:tcW w:type="dxa" w:w="1646"/>
+          </w:tcPr>
+          <w:p>
+            <w:r>
+              <w:t>HMS-FR-016</w:t>
+            </w:r>
+          </w:p>
+        </w:tc>
+        <w:tc>
+          <w:tcPr>
+            <w:tcW w:type="dxa" w:w="2107"/>
+          </w:tcPr>
+          <w:p>
+            <w:r>
+              <w:t>Leave a required room field empty and submit the form.</w:t>
+            </w:r>
+          </w:p>
+        </w:tc>
+        <w:tc>
+          <w:tcPr>
+            <w:tcW w:type="dxa" w:w="1694"/>
+          </w:tcPr>
+          <w:p>
+            <w:r>
+              <w:t>Validation message appears; the room is not saved.</w:t>
+            </w:r>
+          </w:p>
+        </w:tc>
+        <w:tc>
+          <w:tcPr>
+            <w:tcW w:type="dxa" w:w="1657"/>
+          </w:tcPr>
+          <w:p>
+            <w:r>
+              <w:t>High</w:t>
+            </w:r>
+          </w:p>
+        </w:tc>
+      </w:tr>
+      <w:tr>
+        <w:tc>
+          <w:tcPr>
+            <w:tcW w:type="dxa" w:w="1658"/>
+          </w:tcPr>
+          <w:p>
+            <w:r>
+              <w:t>TC-ROOM-007</w:t>
+            </w:r>
+          </w:p>
+        </w:tc>
+        <w:tc>
+          <w:tcPr>
+            <w:tcW w:type="dxa" w:w="1678"/>
+          </w:tcPr>
+          <w:p>
+            <w:r>
+              <w:t>Verify occupancy after allocation</w:t>
+            </w:r>
+          </w:p>
+        </w:tc>
+        <w:tc>
+          <w:tcPr>
+            <w:tcW w:type="dxa" w:w="1646"/>
+          </w:tcPr>
+          <w:p>
+            <w:r>
+              <w:t>HMS-FR-006</w:t>
+            </w:r>
+          </w:p>
+        </w:tc>
+        <w:tc>
+          <w:tcPr>
+            <w:tcW w:type="dxa" w:w="2107"/>
+          </w:tcPr>
+          <w:p>
+            <w:r>
+              <w:t>Allocate one student to a room, then view that room's occupancy and available capacity.</w:t>
+            </w:r>
+          </w:p>
+        </w:tc>
+        <w:tc>
+          <w:tcPr>
+            <w:tcW w:type="dxa" w:w="1694"/>
+          </w:tcPr>
+          <w:p>
+            <w:r>
+              <w:t>Occupancy increases by one and available capacity decreases by one.</w:t>
+            </w:r>
+          </w:p>
+        </w:tc>
+        <w:tc>
+          <w:tcPr>
+            <w:tcW w:type="dxa" w:w="1657"/>
+          </w:tcPr>
+          <w:p>
+            <w:r>
+              <w:t>High</w:t>
             </w:r>
           </w:p>
         </w:tc>

</xml_diff>